<commit_message>
Make long sample changed-only (no unchanged rows, ~2 pages)
</commit_message>
<xml_diff>
--- a/examples/japanese-long-after.docx
+++ b/examples/japanese-long-after.docx
@@ -14,7 +14,7 @@
     </w:p>
     <w:p>
       <w:r>
-        <w:t xml:space="preserve">本条（目的）に関する事項は、本規程の定めるところによる。会社および従業員は、相互の信頼に基づき、本条の趣旨を理解のうえ、誠実にこれを遵守しなければならない。具体的な取扱いおよび手続については、別途定める運用基準または細則によるものとし、必要に応じて適宜見直すことができるものとする。</w:t>
+        <w:t xml:space="preserve">本条（目的）に関する事項は、本規程の定めるところによる。会社および従業員は、相互の信頼に基づき、本条の趣旨を理解のうえ、誠実にこれを遵守しなければならない。具体的な取扱いおよび手続については、別途定める運用基準または細則によるものとし、必要に応じて適宜見直すことができるものとする。また、本改定により、適用対象および手続の一部を変更し、契約社員を含む全従業員に適用することとした。</w:t>
       </w:r>
     </w:p>
     <w:p>
@@ -34,7 +34,7 @@
     </w:p>
     <w:p>
       <w:r>
-        <w:t xml:space="preserve">本条（適用範囲）に関する事項は、本規程の定めるところによる。会社および従業員は、相互の信頼に基づき、本条の趣旨を理解のうえ、誠実にこれを遵守しなければならない。具体的な取扱いおよび手続については、別途定める運用基準または細則によるものとし、必要に応じて適宜見直すことができるものとする。また、本改定により、適用対象および手続の一部を変更し、契約社員を含む全従業員に適用することとした。</w:t>
+        <w:t xml:space="preserve">本条（適用範囲）に関する事項は、本規程の定めるところによる。会社および従業員は、相互の信頼に基づき、本条の趣旨を理解のうえ、誠実にこれを遵守しなければならない。具体的な取扱いおよび手続については、別途定める運用基準または細則によるものとし、必要に応じて適宜見直すことができるものとする。</w:t>
       </w:r>
     </w:p>
     <w:p>
@@ -114,7 +114,7 @@
     </w:p>
     <w:p>
       <w:r>
-        <w:t xml:space="preserve">本条（出張旅費）に関する事項は、本規程の定めるところによる。会社および従業員は、相互の信頼に基づき、本条の趣旨を理解のうえ、誠実にこれを遵守しなければならない。具体的な取扱いおよび手続については、別途定める運用基準または細則によるものとし、必要に応じて適宜見直すことができるものとする。また、本改定により、適用対象および手続の一部を変更し、契約社員を含む全従業員に適用することとした。</w:t>
+        <w:t xml:space="preserve">本条（出張旅費）に関する事項は、本規程の定めるところによる。会社および従業員は、相互の信頼に基づき、本条の趣旨を理解のうえ、誠実にこれを遵守しなければならない。具体的な取扱いおよび手続については、別途定める運用基準または細則によるものとし、必要に応じて適宜見直すことができるものとする。</w:t>
       </w:r>
     </w:p>
     <w:p>
@@ -124,7 +124,7 @@
     </w:p>
     <w:p>
       <w:r>
-        <w:t xml:space="preserve">本条（在宅勤務）に関する事項は、本規程の定めるところによる。会社および従業員は、相互の信頼に基づき、本条の趣旨を理解のうえ、誠実にこれを遵守しなければならない。具体的な取扱いおよび手続については、別途定める運用基準または細則によるものとし、必要に応じて適宜見直すことができるものとする。</w:t>
+        <w:t xml:space="preserve">本条（在宅勤務）に関する事項は、本規程の定めるところによる。会社および従業員は、相互の信頼に基づき、本条の趣旨を理解のうえ、誠実にこれを遵守しなければならない。具体的な取扱いおよび手続については、別途定める運用基準または細則によるものとし、必要に応じて適宜見直すことができるものとする。また、本改定により、適用対象および手続の一部を変更し、契約社員を含む全従業員に適用することとした。</w:t>
       </w:r>
     </w:p>
     <w:p>
@@ -174,7 +174,7 @@
     </w:p>
     <w:p>
       <w:r>
-        <w:t xml:space="preserve">本条（教育研修）に関する事項は、本規程の定めるところによる。会社および従業員は、相互の信頼に基づき、本条の趣旨を理解のうえ、誠実にこれを遵守しなければならない。具体的な取扱いおよび手続については、別途定める運用基準または細則によるものとし、必要に応じて適宜見直すことができるものとする。また、本改定により、適用対象および手続の一部を変更し、契約社員を含む全従業員に適用することとした。</w:t>
+        <w:t xml:space="preserve">本条（教育研修）に関する事項は、本規程の定めるところによる。会社および従業員は、相互の信頼に基づき、本条の趣旨を理解のうえ、誠実にこれを遵守しなければならない。具体的な取扱いおよび手続については、別途定める運用基準または細則によるものとし、必要に応じて適宜見直すことができるものとする。</w:t>
       </w:r>
     </w:p>
     <w:p>
@@ -184,7 +184,7 @@
     </w:p>
     <w:p>
       <w:r>
-        <w:t xml:space="preserve">本条（福利厚生）に関する事項は、本規程の定めるところによる。会社および従業員は、相互の信頼に基づき、本条の趣旨を理解のうえ、誠実にこれを遵守しなければならない。具体的な取扱いおよび手続については、別途定める運用基準または細則によるものとし、必要に応じて適宜見直すことができるものとする。</w:t>
+        <w:t xml:space="preserve">本条（福利厚生）に関する事項は、本規程の定めるところによる。会社および従業員は、相互の信頼に基づき、本条の趣旨を理解のうえ、誠実にこれを遵守しなければならない。具体的な取扱いおよび手続については、別途定める運用基準または細則によるものとし、必要に応じて適宜見直すことができるものとする。また、本改定により、適用対象および手続の一部を変更し、契約社員を含む全従業員に適用することとした。</w:t>
       </w:r>
     </w:p>
     <w:p>

</xml_diff>